<commit_message>
Research paper: terminology, Methods headings; survey updates; research paper exports
Made-with: Cursor

"small edits"
</commit_message>
<xml_diff>
--- a/OpenEvidenceReview.docx
+++ b/OpenEvidenceReview.docx
@@ -1,6 +1,6 @@
 
 <file path=word/document.xml><?xml version="1.0" encoding="utf-8"?>
-<w:document xmlns:wpc="http://schemas.microsoft.com/office/word/2010/wordprocessingCanvas" xmlns:cx="http://schemas.microsoft.com/office/drawing/2014/chartex" xmlns:cx1="http://schemas.microsoft.com/office/drawing/2015/9/8/chartex" xmlns:cx2="http://schemas.microsoft.com/office/drawing/2015/10/21/chartex" xmlns:cx3="http://schemas.microsoft.com/office/drawing/2016/5/9/chartex" xmlns:cx4="http://schemas.microsoft.com/office/drawing/2016/5/10/chartex" xmlns:cx5="http://schemas.microsoft.com/office/drawing/2016/5/11/chartex" xmlns:cx6="http://schemas.microsoft.com/office/drawing/2016/5/12/chartex" xmlns:cx7="http://schemas.microsoft.com/office/drawing/2016/5/13/chartex" xmlns:cx8="http://schemas.microsoft.com/office/drawing/2016/5/14/chartex" xmlns:mc="http://schemas.openxmlformats.org/markup-compatibility/2006" xmlns:aink="http://schemas.microsoft.com/office/drawing/2016/ink" xmlns:am3d="http://schemas.microsoft.com/office/drawing/2017/model3d" xmlns:o="urn:schemas-microsoft-com:office:office" xmlns:r="http://schemas.openxmlformats.org/officeDocument/2006/relationships" xmlns:m="http://schemas.openxmlformats.org/officeDocument/2006/math" xmlns:v="urn:schemas-microsoft-com:vml" xmlns:wp14="http://schemas.microsoft.com/office/word/2010/wordprocessingDrawing" xmlns:wp="http://schemas.openxmlformats.org/drawingml/2006/wordprocessingDrawing" xmlns:w10="urn:schemas-microsoft-com:office:word" xmlns:w="http://schemas.openxmlformats.org/wordprocessingml/2006/main" xmlns:w14="http://schemas.microsoft.com/office/word/2010/wordml" xmlns:w15="http://schemas.microsoft.com/office/word/2012/wordml" xmlns:w16cex="http://schemas.microsoft.com/office/word/2018/wordml/cex" xmlns:w16cid="http://schemas.microsoft.com/office/word/2016/wordml/cid" xmlns:w16="http://schemas.microsoft.com/office/word/2018/wordml" xmlns:w16se="http://schemas.microsoft.com/office/word/2015/wordml/symex" xmlns:wpg="http://schemas.microsoft.com/office/word/2010/wordprocessingGroup" xmlns:wpi="http://schemas.microsoft.com/office/word/2010/wordprocessingInk" xmlns:wne="http://schemas.microsoft.com/office/word/2006/wordml" xmlns:wps="http://schemas.microsoft.com/office/word/2010/wordprocessingShape" mc:Ignorable="w14 w15 w16se w16cid w16 w16cex wp14">
+<w:document xmlns:wpc="http://schemas.microsoft.com/office/word/2010/wordprocessingCanvas" xmlns:cx="http://schemas.microsoft.com/office/drawing/2014/chartex" xmlns:cx1="http://schemas.microsoft.com/office/drawing/2015/9/8/chartex" xmlns:cx2="http://schemas.microsoft.com/office/drawing/2015/10/21/chartex" xmlns:cx3="http://schemas.microsoft.com/office/drawing/2016/5/9/chartex" xmlns:cx4="http://schemas.microsoft.com/office/drawing/2016/5/10/chartex" xmlns:cx5="http://schemas.microsoft.com/office/drawing/2016/5/11/chartex" xmlns:cx6="http://schemas.microsoft.com/office/drawing/2016/5/12/chartex" xmlns:cx7="http://schemas.microsoft.com/office/drawing/2016/5/13/chartex" xmlns:cx8="http://schemas.microsoft.com/office/drawing/2016/5/14/chartex" xmlns:mc="http://schemas.openxmlformats.org/markup-compatibility/2006" xmlns:aink="http://schemas.microsoft.com/office/drawing/2016/ink" xmlns:am3d="http://schemas.microsoft.com/office/drawing/2017/model3d" xmlns:o="urn:schemas-microsoft-com:office:office" xmlns:r="http://schemas.openxmlformats.org/officeDocument/2006/relationships" xmlns:m="http://schemas.openxmlformats.org/officeDocument/2006/math" xmlns:v="urn:schemas-microsoft-com:vml" xmlns:wp14="http://schemas.microsoft.com/office/word/2010/wordprocessingDrawing" xmlns:wp="http://schemas.openxmlformats.org/drawingml/2006/wordprocessingDrawing" xmlns:w10="urn:schemas-microsoft-com:office:word" xmlns:w="http://schemas.openxmlformats.org/wordprocessingml/2006/main" xmlns:w14="http://schemas.microsoft.com/office/word/2010/wordml" xmlns:w15="http://schemas.microsoft.com/office/word/2012/wordml" xmlns:w16cid="http://schemas.microsoft.com/office/word/2016/wordml/cid" xmlns:w16se="http://schemas.microsoft.com/office/word/2015/wordml/symex" xmlns:wpg="http://schemas.microsoft.com/office/word/2010/wordprocessingGroup" xmlns:wpi="http://schemas.microsoft.com/office/word/2010/wordprocessingInk" xmlns:wne="http://schemas.microsoft.com/office/word/2006/wordml" xmlns:wps="http://schemas.microsoft.com/office/word/2010/wordprocessingShape" mc:Ignorable="w14 w15 w16se w16cid wp14">
   <w:body>
     <w:p>
       <w:pPr>
@@ -426,7 +426,25 @@
           <w:sz w:val="24"/>
           <w:szCs w:val="24"/>
         </w:rPr>
-        <w:t xml:space="preserve"> S, Cistulli PA. Sleep Medicine Reviews. </w:t>
+        <w:t xml:space="preserve"> S, </w:t>
+      </w:r>
+      <w:proofErr w:type="spellStart"/>
+      <w:r>
+        <w:rPr>
+          <w:rFonts w:ascii="Times New Roman" w:eastAsia="Times New Roman" w:hAnsi="Times New Roman" w:cs="Times New Roman"/>
+          <w:sz w:val="24"/>
+          <w:szCs w:val="24"/>
+        </w:rPr>
+        <w:t>Cistulli</w:t>
+      </w:r>
+      <w:proofErr w:type="spellEnd"/>
+      <w:r>
+        <w:rPr>
+          <w:rFonts w:ascii="Times New Roman" w:eastAsia="Times New Roman" w:hAnsi="Times New Roman" w:cs="Times New Roman"/>
+          <w:sz w:val="24"/>
+          <w:szCs w:val="24"/>
+        </w:rPr>
+        <w:t xml:space="preserve"> PA. Sleep Medicine Reviews. </w:t>
       </w:r>
       <w:proofErr w:type="gramStart"/>
       <w:r>
@@ -580,6 +598,7 @@
           <w:rFonts w:ascii="Times New Roman" w:eastAsia="Times New Roman" w:hAnsi="Times New Roman" w:cs="Times New Roman"/>
           <w:sz w:val="24"/>
           <w:szCs w:val="24"/>
+          <w:lang w:val="es-MX"/>
         </w:rPr>
       </w:pPr>
       <w:hyperlink r:id="rId21" w:history="1">
@@ -600,7 +619,16 @@
           <w:sz w:val="24"/>
           <w:szCs w:val="24"/>
         </w:rPr>
-        <w:t>. Ning Y, Liu X, Yao H, et al. Medicine. 2020;99(36</w:t>
+        <w:t xml:space="preserve">. </w:t>
+      </w:r>
+      <w:r>
+        <w:rPr>
+          <w:rFonts w:ascii="Times New Roman" w:eastAsia="Times New Roman" w:hAnsi="Times New Roman" w:cs="Times New Roman"/>
+          <w:sz w:val="24"/>
+          <w:szCs w:val="24"/>
+          <w:lang w:val="es-MX"/>
+        </w:rPr>
+        <w:t>Ning Y, Liu X, Yao H, et al. Medicine. 2020;99(36</w:t>
       </w:r>
       <w:proofErr w:type="gramStart"/>
       <w:r>
@@ -608,6 +636,7 @@
           <w:rFonts w:ascii="Times New Roman" w:eastAsia="Times New Roman" w:hAnsi="Times New Roman" w:cs="Times New Roman"/>
           <w:sz w:val="24"/>
           <w:szCs w:val="24"/>
+          <w:lang w:val="es-MX"/>
         </w:rPr>
         <w:t>):e</w:t>
       </w:r>
@@ -617,6 +646,7 @@
           <w:rFonts w:ascii="Times New Roman" w:eastAsia="Times New Roman" w:hAnsi="Times New Roman" w:cs="Times New Roman"/>
           <w:sz w:val="24"/>
           <w:szCs w:val="24"/>
+          <w:lang w:val="es-MX"/>
         </w:rPr>
         <w:t>22068. doi:10.1097/MD.0000000000022068.</w:t>
       </w:r>
@@ -795,12 +825,28 @@
       </w:r>
     </w:p>
     <w:p>
-      <w:r>
+      <w:pPr>
+        <w:rPr>
+          <w:b/>
+        </w:rPr>
+      </w:pPr>
+      <w:r>
+        <w:rPr>
+          <w:b/>
+        </w:rPr>
         <w:t>One part uses "0-2 points" as proxy for no intervention (good dose-response idea).</w:t>
       </w:r>
     </w:p>
     <w:p>
-      <w:r>
+      <w:pPr>
+        <w:rPr>
+          <w:b/>
+        </w:rPr>
+      </w:pPr>
+      <w:r>
+        <w:rPr>
+          <w:b/>
+        </w:rPr>
         <w:t>Another says "within-subject design" using anticipated vs. actual symptoms (new addition, but survey doesn't collect "anticipated" severity per the Table 2 data list).</w:t>
       </w:r>
     </w:p>
@@ -812,210 +858,166 @@
     </w:p>
     <w:p>
       <w:r>
-        <w:t>Recommendation: Remove the within-subject anticipated-vs-actual claim unless you're adding those questions now. Stick with the dose-response + historical baseline approach (it's stronger anyway, as self-reported "anticipated" would be biased too</w:t>
+        <w:t>Recommendation: Remove the within-subject anticipated-vs-actual claim unless you're adding those questions now. Stick with the dose-response + historical baseline approach (it's stronger anyway, as self-reported "anticipated" would be biased too)</w:t>
+      </w:r>
+    </w:p>
+    <w:p>
+      <w:r>
+        <w:t>In Data Analysis → after "Primary Research Question":</w:t>
+      </w:r>
+    </w:p>
+    <w:p>
+      <w:r>
+        <w:t>Remove this paragraph:</w:t>
+      </w:r>
+    </w:p>
+    <w:p>
+      <w:r>
+        <w:t>"This observational study lacks a randomized true control arm... (anticipated symptom severity based on prior travel experience, and (2) post-travel symptom severity...)"Replace with (or add after the question):</w:t>
+      </w:r>
+    </w:p>
+    <w:p>
+      <w:r>
+        <w:t>We address the absence of a concurrent control group through:</w:t>
+      </w:r>
+    </w:p>
+    <w:p>
+      <w:r>
+        <w:lastRenderedPageBreak/>
+        <w:t>Dose-response stratification by objectively logged stimulation level (0–2, 3–5, 6–8, 9–12 points), testing whether higher adherence associates with lower severity.</w:t>
+      </w:r>
+    </w:p>
+    <w:p>
+      <w:r>
+        <w:t>Comparison to historical non-intervention severity means from Waterhouse et al. (2007), stratified by time zones crossed (1.8 for 1–2 TZ, 2.5 for 3–5, 3.1 for 6–8, 3.6 for 9+).</w:t>
+      </w:r>
+    </w:p>
+    <w:p/>
+    <w:p>
+      <w:r>
+        <w:t>Note: The Waterhouse values you list match what appears in summaries of that paper (though exact means vary slightly by direction/individual factors; your ranges are reasonable approximations for benchmarking).</w:t>
+      </w:r>
+    </w:p>
+    <w:p>
+      <w:r>
+        <w:t>Add to Statistical Considerations (new short paragraph under Data Analysis or in Limitations):</w:t>
+      </w:r>
+    </w:p>
+    <w:p>
+      <w:r>
+        <w:rPr>
+          <w:b/>
+        </w:rPr>
+        <w:t>Multiple comparisons across adherence groups and time-zone strata will be addressed with Bonferroni correction or false discovery rate control. Effect sizes (Cohen's d or partial eta²) will be reported alongside p-values to aid interpretation. Power calculations indicate that n&gt;300–400 complete cases per major subgroup will provide &gt;80% power to detect medium effects (d=0.5) at α=0.05.3.</w:t>
+      </w:r>
+      <w:r>
+        <w:t xml:space="preserve"> </w:t>
+      </w:r>
+    </w:p>
+    <w:p/>
+    <w:p>
+      <w:r>
+        <w:t>Liverpool Jet Lag Questionnaire Adaptation – Add Brief Justification</w:t>
+      </w:r>
+    </w:p>
+    <w:p>
+      <w:r>
+        <w:t>You call it "streamlined assessment based on the Liverpool Jet Lag Questionnaire's core symptom domains." From literature, the original LJLQ has ~15 items (VAS scales for jet lag amount, fatigue, sleep onset/quality/duration, concentration, irritability, bowel/appetite changes, etc.), with a single global "jet lag" rating.</w:t>
+      </w:r>
+    </w:p>
+    <w:p>
+      <w:r>
+        <w:t>Your survey captures: sleep disturbance, daytime fatigue, difficulty concentrating, irritability, lack of motivation/energy, GI issues (plus overall anticipated, but see above).</w:t>
+      </w:r>
+    </w:p>
+    <w:p>
+      <w:r>
+        <w:t xml:space="preserve">Strength: </w:t>
+      </w:r>
+    </w:p>
+    <w:p>
+      <w:r>
+        <w:t>You hit the main validated domains (fatigue/daytime impairment, sleep, concentration, GI/bowel, irritability/motivation).</w:t>
+      </w:r>
+    </w:p>
+    <w:p>
+      <w:r>
+        <w:t>Recommendation: Add one sentence in Methods after mentioning the survey:</w:t>
+      </w:r>
+    </w:p>
+    <w:p>
+      <w:r>
+        <w:t xml:space="preserve">The streamlined survey retains the LJLQ's core validated symptom domains (sleep quality/disturbance, daytime fatigue, concentration difficulties, irritability/motivation, gastrointestinal function) as 1–5 severity ratings, omitting </w:t>
       </w:r>
       <w:proofErr w:type="gramStart"/>
       <w:r>
-        <w:t>).In</w:t>
+        <w:t>less</w:t>
       </w:r>
       <w:proofErr w:type="gramEnd"/>
       <w:r>
-        <w:t xml:space="preserve"> Data Analysis → after "Primary Research Question":</w:t>
-      </w:r>
-    </w:p>
-    <w:p>
-      <w:r>
-        <w:t>Remove this paragraph:</w:t>
-      </w:r>
-    </w:p>
-    <w:p>
-      <w:r>
-        <w:t>"This observational study lacks a randomized true control arm... (anticipated symptom severity based on prior travel experience, and (2) post-travel symptom severity...)"Replace with (or add after the question):</w:t>
-      </w:r>
-    </w:p>
-    <w:p>
-      <w:r>
-        <w:t>We address the absence of a concurrent control group through:</w:t>
-      </w:r>
-    </w:p>
-    <w:p>
-      <w:r>
-        <w:t>Dose-response stratification by objectively logged stimulation level (0–2, 3–5, 6–8, 9–12 points), testing whether higher adherence associates with lower severity.</w:t>
+        <w:t xml:space="preserve"> central items (e.g., detailed appetite/bowel frequency changes) to reduce participant burden in a mobile context.</w:t>
+      </w:r>
+    </w:p>
+    <w:p>
+      <w:r>
+        <w:t>This shows thoughtful adaptation without claiming full validation.</w:t>
+      </w:r>
+    </w:p>
+    <w:p/>
+    <w:p/>
+    <w:p>
+      <w:r>
+        <w:t>CDC Acknowledgment – Add Short Paragraph</w:t>
       </w:r>
     </w:p>
     <w:p>
       <w:r>
         <w:lastRenderedPageBreak/>
-        <w:t>Comparison to historical non-intervention severity means from Waterhouse et al. (2007), stratified by time zones crossed (1.8 for 1–2 TZ, 2.5 for 3–5, 3.1 for 6–8, 3.6 for 9+).</w:t>
-      </w:r>
-    </w:p>
-    <w:p/>
-    <w:p>
-      <w:r>
-        <w:t>Note: The Waterhouse values you list match what appears in summaries of that paper (though exact means vary slightly by direction/individual factors; your ranges are reasonable approximations for benchmarking).</w:t>
-      </w:r>
-    </w:p>
-    <w:p>
-      <w:r>
-        <w:t>Add to Statistical Considerations (new short paragraph under Data Analysis or in Limitations):</w:t>
-      </w:r>
-    </w:p>
-    <w:p>
-      <w:r>
-        <w:t>Multiple comparisons across adherence groups and time-zone strata will be addressed with Bonferroni correction or false discovery rate control. Effect sizes (Cohen's d or partial eta²) will be reported alongside p-values to aid interpretation. Power calculations indicate that n&gt;300–400 complete cases per major subgroup will provide &gt;80% power to detect medium effects (d=0.5) at α=0.05.3. Liverpool Jet Lag Questionnaire Adaptation – Add Brief Justification</w:t>
-      </w:r>
-    </w:p>
-    <w:p>
-      <w:r>
-        <w:t>You call it "streamlined assessment based on the Liverpool Jet Lag Questionnaire's core symptom domains." From literature, the original LJLQ has ~15 items (VAS scales for jet lag amount, fatigue, sleep onset/quality/duration, concentration, irritability, bowel/appetite changes, etc.), with a single global "jet lag" rating.</w:t>
-      </w:r>
-    </w:p>
-    <w:p>
-      <w:r>
-        <w:t>Your survey captures: sleep disturbance, daytime fatigue, difficulty concentrating, irritability, lack of motivation/energy, GI issues (plus overall anticipated, but see above).</w:t>
-      </w:r>
-    </w:p>
-    <w:p>
-      <w:r>
-        <w:t xml:space="preserve">Strength: </w:t>
-      </w:r>
-    </w:p>
-    <w:p>
-      <w:r>
-        <w:t>You hit the main validated domains (fatigue/daytime impairment, sleep, concentration, GI/bowel, irritability/motivation).</w:t>
-      </w:r>
-    </w:p>
-    <w:p>
-      <w:r>
-        <w:t>Recommendation: Add one sentence in Methods after mentioning the survey:</w:t>
-      </w:r>
-    </w:p>
-    <w:p>
-      <w:r>
-        <w:t xml:space="preserve">The streamlined survey retains the LJLQ's core validated symptom domains (sleep quality/disturbance, daytime fatigue, concentration difficulties, irritability/motivation, gastrointestinal function) as 1–5 severity ratings, omitting </w:t>
-      </w:r>
-      <w:proofErr w:type="gramStart"/>
-      <w:r>
-        <w:t>less</w:t>
-      </w:r>
-      <w:proofErr w:type="gramEnd"/>
-      <w:r>
-        <w:t xml:space="preserve"> central items (e.g., detailed appetite/bowel frequency changes) to reduce participant burden in a mobile context.</w:t>
-      </w:r>
-    </w:p>
-    <w:p>
-      <w:r>
-        <w:t>This shows thoughtful adaptation without claiming full validation.4. Point Substitutions – Bolster Theoretical Rationale</w:t>
-      </w:r>
-    </w:p>
-    <w:p>
-      <w:r>
-        <w:t>You already say "TCM theory holds that the entire meridian is active... even approximate... should still provide benefit."</w:t>
-      </w:r>
-    </w:p>
-    <w:p>
-      <w:r>
-        <w:t>Recommendation: Add one sentence in Acupuncture Theory section (after substitutions explanation):</w:t>
-      </w:r>
-    </w:p>
-    <w:p>
-      <w:r>
-        <w:t>This pragmatic modification aligns with broader TCM channel theory, where stimulation at any accessible point along a meridian during its horary window is held to influence the organ system's qi flow and circadian activity, though classical texts prioritize the specific horary point.5. CDC Acknowledgment – Add Short Paragraph</w:t>
-      </w:r>
-    </w:p>
-    <w:p>
+        <w:t>Introduction: "acupuncturists have proposed an alternative method that has not been tested until now." → Good, but add "systematically" if space.</w:t>
+      </w:r>
+    </w:p>
+    <w:p>
+      <w:r>
+        <w:t>Table 1 caption: "Chinese Organ Clock Schedule" → perhaps "24-Hour Organ Clock with Horary Points (Adapted)"</w:t>
+      </w:r>
+    </w:p>
+    <w:p>
+      <w:r>
+        <w:t xml:space="preserve">References: Some entries have mismatched numbering/comments (e.g., Huangdi </w:t>
+      </w:r>
       <w:proofErr w:type="spellStart"/>
       <w:r>
-        <w:t>OpenEvidence</w:t>
+        <w:t>Neijing</w:t>
       </w:r>
       <w:proofErr w:type="spellEnd"/>
       <w:r>
-        <w:t xml:space="preserve"> flagged the CDC's lack of endorsement. You can address it briefly without defensiveness.</w:t>
-      </w:r>
-    </w:p>
-    <w:p/>
-    <w:p>
-      <w:r>
-        <w:t>Recommendation: Add under Discussion (after confounding variables or before interdisciplinary framework):</w:t>
-      </w:r>
-    </w:p>
-    <w:p>
-      <w:r>
-        <w:t xml:space="preserve">Current CDC Yellow Book guidance on jet lag emphasizes timed light exposure, melatonin, and behavioral adjustments, with no endorsement of acupressure or acupuncture due to limited high-quality evidence. This study addresses that evidence gap by providing the first prospective, large-scale dataset on a structured chronoacupuncture protocol in real-world travelers.6. Minor Polish &amp; </w:t>
+        <w:t xml:space="preserve"> as 8 but </w:t>
       </w:r>
       <w:proofErr w:type="spellStart"/>
       <w:r>
-        <w:t>TyposAbstract</w:t>
+        <w:t>Khoe</w:t>
       </w:r>
       <w:proofErr w:type="spellEnd"/>
       <w:r>
-        <w:t xml:space="preserve">: "This is </w:t>
-      </w:r>
-      <w:proofErr w:type="spellStart"/>
-      <w:r>
-        <w:t>follwed</w:t>
-      </w:r>
-      <w:proofErr w:type="spellEnd"/>
-      <w:r>
-        <w:t xml:space="preserve"> by a survey" → "followed"</w:t>
-      </w:r>
-    </w:p>
-    <w:p>
-      <w:r>
-        <w:t>Introduction: "acupuncturists have proposed an alternative method that has not been tested until now." → Good, but add "systematically" if space.</w:t>
-      </w:r>
-    </w:p>
-    <w:p>
-      <w:r>
-        <w:t>Table 1 caption: "Chinese Organ Clock Schedule" → perhaps "24-Hour Organ Clock with Horary Points (Adapted)"</w:t>
-      </w:r>
-    </w:p>
-    <w:p>
-      <w:r>
-        <w:t xml:space="preserve">References: Some entries have mismatched numbering/comments (e.g., Huangdi </w:t>
-      </w:r>
-      <w:proofErr w:type="spellStart"/>
-      <w:r>
-        <w:t>Neijing</w:t>
-      </w:r>
-      <w:proofErr w:type="spellEnd"/>
-      <w:r>
-        <w:t xml:space="preserve"> as 8 but </w:t>
-      </w:r>
-      <w:proofErr w:type="spellStart"/>
-      <w:r>
-        <w:t>Khoe</w:t>
-      </w:r>
-      <w:proofErr w:type="spellEnd"/>
-      <w:r>
         <w:t xml:space="preserve"> as 9). Clean if submitting.</w:t>
       </w:r>
     </w:p>
-    <w:p>
-      <w:r>
-        <w:t>Ethics: Strong privacy description—excellent for anonymous app research.</w:t>
-      </w:r>
-    </w:p>
-    <w:p/>
-    <w:p>
-      <w:r>
-        <w:t xml:space="preserve">Overall </w:t>
-      </w:r>
-      <w:proofErr w:type="spellStart"/>
-      <w:r>
-        <w:t>AssessmentWith</w:t>
-      </w:r>
-      <w:proofErr w:type="spellEnd"/>
-      <w:r>
-        <w:t xml:space="preserve"> these tweaks, the paper reads as a thoughtful, transparent pragmatic observational study—not overclaiming causality, owning limitations (no co-intervention data, self-selection, no true control, subjective outcomes), and highlighting unique strengths (objective timestamps, large n target, dose-response, ecological validity</w:t>
-      </w:r>
-      <w:proofErr w:type="gramStart"/>
-      <w:r>
-        <w:t>).You're</w:t>
-      </w:r>
-      <w:proofErr w:type="gramEnd"/>
-      <w:r>
-        <w:t xml:space="preserve"> in excellent shape to keep collecting until n&gt;1000 (or even 300–500 for preliminary publication in complementary/travel-medicine journals). Once you have real results, the chart + dose-response plots will be compelling visuals.</w:t>
+    <w:p/>
+    <w:p>
+      <w:r>
+        <w:t>Overall Assessment</w:t>
+      </w:r>
+    </w:p>
+    <w:p>
+      <w:r>
+        <w:t>With these tweaks, the paper reads as a thoughtful, transparent pragmatic observational study—not overclaiming causality, owning limitations (no co-intervention data, self-selection, no true control, subjective outcomes), and highlighting unique strengths (objective timestamps, large n target, dose-response, ecological validity).</w:t>
+      </w:r>
+    </w:p>
+    <w:p>
+      <w:bookmarkStart w:id="0" w:name="_GoBack"/>
+      <w:bookmarkEnd w:id="0"/>
+      <w:r>
+        <w:t>You're in excellent shape to keep collecting until n&gt;1000 (or even 300–500 for preliminary publication in complementary/travel-medicine journals). Once you have real results, the chart + dose-response plots will be compelling visuals.</w:t>
       </w:r>
     </w:p>
     <w:p/>
@@ -1056,7 +1058,11 @@
     </w:p>
     <w:p>
       <w:r>
-        <w:t xml:space="preserve">This observational study lacks a randomized true control arm, as ethical and practical constraints of anonymous volunteer participation preclude randomization or a no-app sham condition. Instead, we employ an internal dose-response analysis by stratifying participants according to the number of horary-point stimulations completed (0–2 points as minimal-exposure proxy versus higher adherence groups). This approach mitigates some concerns about placebo effects from the app framework itself, because any true effect should demonstrate a graded relationship with adherence. We also benchmark against the comprehensive historical data of Waterhouse et al. (2007), recognizing that our self-selected sample may differ in motivation and health consciousness. </w:t>
+        <w:t xml:space="preserve">This observational study lacks a randomized true control arm, as ethical and practical constraints of anonymous volunteer participation preclude randomization or a no-app sham condition. Instead, we employ an internal dose-response analysis by stratifying participants according to the number of horary-point stimulations completed (0–2 points as minimal-exposure proxy versus higher adherence groups). This approach mitigates some concerns about placebo effects from the app framework itself, because </w:t>
+      </w:r>
+      <w:r>
+        <w:lastRenderedPageBreak/>
+        <w:t xml:space="preserve">any true effect should demonstrate a graded relationship with adherence. We also benchmark against the comprehensive historical data of Waterhouse et al. (2007), recognizing that our self-selected sample may differ in motivation and health consciousness. </w:t>
       </w:r>
     </w:p>
     <w:p/>
@@ -1073,10 +1079,7 @@
     </w:p>
     <w:p>
       <w:r>
-        <w:t>Participants are self-selected travelers who actively sought and downloaded a free jet-lag app. They are therefore likely more motivated and health-conscious than the average international traveler. This introduces selection bias and limits broad generalizability; however, it simultaneously enhances ecological validity for the exact population most likely to adopt such an intervention in real life. Large sample size (&gt;1,000 anticipated) and subgroup analyses by time zones crossed will help characterize heterogeneity.</w:t>
-      </w:r>
-      <w:r>
-        <w:t xml:space="preserve"> </w:t>
+        <w:t xml:space="preserve">Participants are self-selected travelers who actively sought and downloaded a free jet-lag app. They are therefore likely more motivated and health-conscious than the average international traveler. This introduces selection bias and limits broad generalizability; however, it simultaneously enhances ecological validity for the exact population most likely to adopt such an intervention in real life. Large sample size (&gt;1,000 anticipated) and subgroup analyses by time zones crossed will help characterize heterogeneity. </w:t>
       </w:r>
     </w:p>
     <w:p/>
@@ -1125,7 +1128,11 @@
     </w:p>
     <w:p>
       <w:r>
-        <w:t xml:space="preserve">With an anticipated sample exceeding 1,000 complete cases, statistical power will be adequate for detecting moderate effect sizes even after stratification by time zones and adherence level. To address multiple comparisons across subgroups, we will apply Bonferroni correction or report results alongside unadjusted p-values with explicit caution. Baseline comparisons to Waterhouse et al. (2007) are acknowledged as imperfect due to population differences; sensitivity analyses excluding outliers and subgroup-specific effect sizes will be </w:t>
+        <w:t xml:space="preserve">With an anticipated sample exceeding 1,000 complete cases, statistical power will be adequate for detecting moderate effect sizes even after stratification by time zones and adherence level. To address multiple comparisons across subgroups, we will apply Bonferroni correction or report results alongside unadjusted p-values with explicit caution. Baseline comparisons to Waterhouse et al. (2007) are </w:t>
+      </w:r>
+      <w:r>
+        <w:lastRenderedPageBreak/>
+        <w:t xml:space="preserve">acknowledged as imperfect due to population differences; sensitivity analyses excluding outliers and subgroup-specific effect sizes will be </w:t>
       </w:r>
       <w:proofErr w:type="spellStart"/>
       <w:proofErr w:type="gramStart"/>
@@ -1225,26 +1232,26 @@
     </w:p>
     <w:p>
       <w:r>
+        <w:t>Future directions paragraph (add to Discussion): “Future app versions could optionally integrate Apple Health wearable data or randomize users to sham-point schedules, but the current design prioritizes maximal real-world reach and minimal barriers.”</w:t>
+      </w:r>
+    </w:p>
+    <w:p/>
+    <w:p>
+      <w:r>
+        <w:t xml:space="preserve">Why This Approach Works in Your </w:t>
+      </w:r>
+      <w:proofErr w:type="spellStart"/>
+      <w:r>
+        <w:t>ContextYou</w:t>
+      </w:r>
+      <w:proofErr w:type="spellEnd"/>
+      <w:r>
+        <w:t xml:space="preserve"> stay true to the volunteer, anonymous model—no unrealistic randomization or mandatory wearables.</w:t>
+      </w:r>
+    </w:p>
+    <w:p>
+      <w:r>
         <w:lastRenderedPageBreak/>
-        <w:t>Future directions paragraph (add to Discussion): “Future app versions could optionally integrate Apple Health wearable data or randomize users to sham-point schedules, but the current design prioritizes maximal real-world reach and minimal barriers.”</w:t>
-      </w:r>
-    </w:p>
-    <w:p/>
-    <w:p>
-      <w:r>
-        <w:t xml:space="preserve">Why This Approach Works in Your </w:t>
-      </w:r>
-      <w:proofErr w:type="spellStart"/>
-      <w:r>
-        <w:t>ContextYou</w:t>
-      </w:r>
-      <w:proofErr w:type="spellEnd"/>
-      <w:r>
-        <w:t xml:space="preserve"> stay true to the volunteer, anonymous model—no unrealistic randomization or mandatory wearables.</w:t>
-      </w:r>
-    </w:p>
-    <w:p>
-      <w:r>
         <w:t>You turn every critique into a transparent strength (e.g., “dose-response is feasible here precisely because we log objective timestamps”).</w:t>
       </w:r>
     </w:p>
@@ -1276,7 +1283,7 @@
 </file>
 
 <file path=word/numbering.xml><?xml version="1.0" encoding="utf-8"?>
-<w:numbering xmlns:wpc="http://schemas.microsoft.com/office/word/2010/wordprocessingCanvas" xmlns:cx="http://schemas.microsoft.com/office/drawing/2014/chartex" xmlns:cx1="http://schemas.microsoft.com/office/drawing/2015/9/8/chartex" xmlns:cx2="http://schemas.microsoft.com/office/drawing/2015/10/21/chartex" xmlns:cx3="http://schemas.microsoft.com/office/drawing/2016/5/9/chartex" xmlns:cx4="http://schemas.microsoft.com/office/drawing/2016/5/10/chartex" xmlns:cx5="http://schemas.microsoft.com/office/drawing/2016/5/11/chartex" xmlns:cx6="http://schemas.microsoft.com/office/drawing/2016/5/12/chartex" xmlns:cx7="http://schemas.microsoft.com/office/drawing/2016/5/13/chartex" xmlns:cx8="http://schemas.microsoft.com/office/drawing/2016/5/14/chartex" xmlns:mc="http://schemas.openxmlformats.org/markup-compatibility/2006" xmlns:aink="http://schemas.microsoft.com/office/drawing/2016/ink" xmlns:am3d="http://schemas.microsoft.com/office/drawing/2017/model3d" xmlns:o="urn:schemas-microsoft-com:office:office" xmlns:r="http://schemas.openxmlformats.org/officeDocument/2006/relationships" xmlns:m="http://schemas.openxmlformats.org/officeDocument/2006/math" xmlns:v="urn:schemas-microsoft-com:vml" xmlns:wp14="http://schemas.microsoft.com/office/word/2010/wordprocessingDrawing" xmlns:wp="http://schemas.openxmlformats.org/drawingml/2006/wordprocessingDrawing" xmlns:w10="urn:schemas-microsoft-com:office:word" xmlns:w="http://schemas.openxmlformats.org/wordprocessingml/2006/main" xmlns:w14="http://schemas.microsoft.com/office/word/2010/wordml" xmlns:w15="http://schemas.microsoft.com/office/word/2012/wordml" xmlns:w16cex="http://schemas.microsoft.com/office/word/2018/wordml/cex" xmlns:w16cid="http://schemas.microsoft.com/office/word/2016/wordml/cid" xmlns:w16="http://schemas.microsoft.com/office/word/2018/wordml" xmlns:w16se="http://schemas.microsoft.com/office/word/2015/wordml/symex" xmlns:wpg="http://schemas.microsoft.com/office/word/2010/wordprocessingGroup" xmlns:wpi="http://schemas.microsoft.com/office/word/2010/wordprocessingInk" xmlns:wne="http://schemas.microsoft.com/office/word/2006/wordml" xmlns:wps="http://schemas.microsoft.com/office/word/2010/wordprocessingShape" mc:Ignorable="w14 w15 w16se w16cid w16 w16cex wp14">
+<w:numbering xmlns:wpc="http://schemas.microsoft.com/office/word/2010/wordprocessingCanvas" xmlns:cx="http://schemas.microsoft.com/office/drawing/2014/chartex" xmlns:cx1="http://schemas.microsoft.com/office/drawing/2015/9/8/chartex" xmlns:cx2="http://schemas.microsoft.com/office/drawing/2015/10/21/chartex" xmlns:cx3="http://schemas.microsoft.com/office/drawing/2016/5/9/chartex" xmlns:cx4="http://schemas.microsoft.com/office/drawing/2016/5/10/chartex" xmlns:cx5="http://schemas.microsoft.com/office/drawing/2016/5/11/chartex" xmlns:cx6="http://schemas.microsoft.com/office/drawing/2016/5/12/chartex" xmlns:cx7="http://schemas.microsoft.com/office/drawing/2016/5/13/chartex" xmlns:cx8="http://schemas.microsoft.com/office/drawing/2016/5/14/chartex" xmlns:mc="http://schemas.openxmlformats.org/markup-compatibility/2006" xmlns:aink="http://schemas.microsoft.com/office/drawing/2016/ink" xmlns:am3d="http://schemas.microsoft.com/office/drawing/2017/model3d" xmlns:o="urn:schemas-microsoft-com:office:office" xmlns:r="http://schemas.openxmlformats.org/officeDocument/2006/relationships" xmlns:m="http://schemas.openxmlformats.org/officeDocument/2006/math" xmlns:v="urn:schemas-microsoft-com:vml" xmlns:wp14="http://schemas.microsoft.com/office/word/2010/wordprocessingDrawing" xmlns:wp="http://schemas.openxmlformats.org/drawingml/2006/wordprocessingDrawing" xmlns:w10="urn:schemas-microsoft-com:office:word" xmlns:w="http://schemas.openxmlformats.org/wordprocessingml/2006/main" xmlns:w14="http://schemas.microsoft.com/office/word/2010/wordml" xmlns:w15="http://schemas.microsoft.com/office/word/2012/wordml" xmlns:w16cid="http://schemas.microsoft.com/office/word/2016/wordml/cid" xmlns:w16se="http://schemas.microsoft.com/office/word/2015/wordml/symex" xmlns:wpg="http://schemas.microsoft.com/office/word/2010/wordprocessingGroup" xmlns:wpi="http://schemas.microsoft.com/office/word/2010/wordprocessingInk" xmlns:wne="http://schemas.microsoft.com/office/word/2006/wordml" xmlns:wps="http://schemas.microsoft.com/office/word/2010/wordprocessingShape" mc:Ignorable="w14 w15 w16se w16cid wp14">
   <w:abstractNum w:abstractNumId="0" w15:restartNumberingAfterBreak="0">
     <w:nsid w:val="75BF02F6"/>
     <w:multiLevelType w:val="multilevel"/>
@@ -1397,7 +1404,7 @@
 </file>
 
 <file path=word/styles.xml><?xml version="1.0" encoding="utf-8"?>
-<w:styles xmlns:mc="http://schemas.openxmlformats.org/markup-compatibility/2006" xmlns:r="http://schemas.openxmlformats.org/officeDocument/2006/relationships" xmlns:w="http://schemas.openxmlformats.org/wordprocessingml/2006/main" xmlns:w14="http://schemas.microsoft.com/office/word/2010/wordml" xmlns:w15="http://schemas.microsoft.com/office/word/2012/wordml" xmlns:w16cex="http://schemas.microsoft.com/office/word/2018/wordml/cex" xmlns:w16cid="http://schemas.microsoft.com/office/word/2016/wordml/cid" xmlns:w16="http://schemas.microsoft.com/office/word/2018/wordml" xmlns:w16se="http://schemas.microsoft.com/office/word/2015/wordml/symex" mc:Ignorable="w14 w15 w16se w16cid w16 w16cex">
+<w:styles xmlns:mc="http://schemas.openxmlformats.org/markup-compatibility/2006" xmlns:r="http://schemas.openxmlformats.org/officeDocument/2006/relationships" xmlns:w="http://schemas.openxmlformats.org/wordprocessingml/2006/main" xmlns:w14="http://schemas.microsoft.com/office/word/2010/wordml" xmlns:w15="http://schemas.microsoft.com/office/word/2012/wordml" xmlns:w16cid="http://schemas.microsoft.com/office/word/2016/wordml/cid" xmlns:w16se="http://schemas.microsoft.com/office/word/2015/wordml/symex" mc:Ignorable="w14 w15 w16se w16cid">
   <w:docDefaults>
     <w:rPrDefault>
       <w:rPr>
@@ -1413,7 +1420,7 @@
       </w:pPr>
     </w:pPrDefault>
   </w:docDefaults>
-  <w:latentStyles w:defLockedState="0" w:defUIPriority="99" w:defSemiHidden="0" w:defUnhideWhenUsed="0" w:defQFormat="0" w:count="376">
+  <w:latentStyles w:defLockedState="0" w:defUIPriority="99" w:defSemiHidden="0" w:defUnhideWhenUsed="0" w:defQFormat="0" w:count="375">
     <w:lsdException w:name="Normal" w:uiPriority="0" w:qFormat="1"/>
     <w:lsdException w:name="heading 1" w:uiPriority="9" w:qFormat="1"/>
     <w:lsdException w:name="heading 2" w:semiHidden="1" w:uiPriority="9" w:unhideWhenUsed="1" w:qFormat="1"/>
@@ -1789,7 +1796,6 @@
     <w:lsdException w:name="Smart Hyperlink" w:semiHidden="1" w:unhideWhenUsed="1"/>
     <w:lsdException w:name="Hashtag" w:semiHidden="1" w:unhideWhenUsed="1"/>
     <w:lsdException w:name="Unresolved Mention" w:semiHidden="1" w:unhideWhenUsed="1"/>
-    <w:lsdException w:name="Smart Link" w:semiHidden="1" w:unhideWhenUsed="1"/>
   </w:latentStyles>
   <w:style w:type="paragraph" w:default="1" w:styleId="Normal">
     <w:name w:val="Normal"/>

</xml_diff>